<commit_message>
I have wondered for today's work. I have completed the volume - 02 of the Operating systems and i have observed some of the patterns from that same volume.
Initially i was just observing the Human-Frictions from the Operating-Systems so when i am completing i just observed the patterns. As like that we went one version ahead so we just updated metrics version to 3.1 and some of the new records have created  some of the useless stats were found and deleted entirely.
Research.Understand.Build

Co-Authored-By: jothish-blip <215570346+jothish-blip@users.noreply.github.com>
</commit_message>
<xml_diff>
--- a/atlas/Registries/Pattern-Registry.docx
+++ b/atlas/Registries/Pattern-Registry.docx
@@ -1,7 +1,52 @@
 
 <file path=word/document.xml><?xml version="1.0" encoding="utf-8"?>
-<w:document xmlns:wpc="http://schemas.microsoft.com/office/word/2010/wordprocessingCanvas" xmlns:cx="http://schemas.microsoft.com/office/drawing/2014/chartex" xmlns:cx1="http://schemas.microsoft.com/office/drawing/2015/9/8/chartex" xmlns:cx2="http://schemas.microsoft.com/office/drawing/2015/10/21/chartex" xmlns:cx3="http://schemas.microsoft.com/office/drawing/2016/5/9/chartex" xmlns:cx4="http://schemas.microsoft.com/office/drawing/2016/5/10/chartex" xmlns:cx5="http://schemas.microsoft.com/office/drawing/2016/5/11/chartex" xmlns:cx6="http://schemas.microsoft.com/office/drawing/2016/5/12/chartex" xmlns:cx7="http://schemas.microsoft.com/office/drawing/2016/5/13/chartex" xmlns:cx8="http://schemas.microsoft.com/office/drawing/2016/5/14/chartex" xmlns:mc="http://schemas.openxmlformats.org/markup-compatibility/2006" xmlns:aink="http://schemas.microsoft.com/office/drawing/2016/ink" xmlns:am3d="http://schemas.microsoft.com/office/drawing/2017/model3d" xmlns:o="urn:schemas-microsoft-com:office:office" xmlns:oel="http://schemas.microsoft.com/office/2019/extlst" xmlns:r="http://schemas.openxmlformats.org/officeDocument/2006/relationships" xmlns:m="http://schemas.openxmlformats.org/officeDocument/2006/math" xmlns:v="urn:schemas-microsoft-com:vml" xmlns:wp14="http://schemas.microsoft.com/office/word/2010/wordprocessingDrawing" xmlns:wp="http://schemas.openxmlformats.org/drawingml/2006/wordprocessingDrawing" xmlns:w10="urn:schemas-microsoft-com:office:word" xmlns:w="http://schemas.openxmlformats.org/wordprocessingml/2006/main" xmlns:w14="http://schemas.microsoft.com/office/word/2010/wordml" xmlns:w15="http://schemas.microsoft.com/office/word/2012/wordml" xmlns:w16cex="http://schemas.microsoft.com/office/word/2018/wordml/cex" xmlns:w16cid="http://schemas.microsoft.com/office/word/2016/wordml/cid" xmlns:w16="http://schemas.microsoft.com/office/word/2018/wordml" xmlns:w16du="http://schemas.microsoft.com/office/word/2023/wordml/word16du" xmlns:w16sdtdh="http://schemas.microsoft.com/office/word/2020/wordml/sdtdatahash" xmlns:w16sdtfl="http://schemas.microsoft.com/office/word/2024/wordml/sdtformatlock" xmlns:w16se="http://schemas.microsoft.com/office/word/2015/wordml/symex" xmlns:wpg="http://schemas.microsoft.com/office/word/2010/wordprocessingGroup" xmlns:wpi="http://schemas.microsoft.com/office/word/2010/wordprocessingInk" xmlns:wne="http://schemas.microsoft.com/office/word/2006/wordml" xmlns:wps="http://schemas.microsoft.com/office/word/2010/wordprocessingShape" mc:Ignorable="w14 w15 w16se w16cid w16 w16cex w16sdtdh w16sdtfl w16du wp14">
+<w:document xmlns:wpc="http://schemas.microsoft.com/office/word/2010/wordprocessingCanvas" xmlns:cx="http://schemas.microsoft.com/office/drawing/2014/chartex" xmlns:cx1="http://schemas.microsoft.com/office/drawing/2015/9/8/chartex" xmlns:cx2="http://schemas.microsoft.com/office/drawing/2015/10/21/chartex" xmlns:cx3="http://schemas.microsoft.com/office/drawing/2016/5/9/chartex" xmlns:cx4="http://schemas.microsoft.com/office/drawing/2016/5/10/chartex" xmlns:cx5="http://schemas.microsoft.com/office/drawing/2016/5/11/chartex" xmlns:cx6="http://schemas.microsoft.com/office/drawing/2016/5/12/chartex" xmlns:cx7="http://schemas.microsoft.com/office/drawing/2016/5/13/chartex" xmlns:cx8="http://schemas.microsoft.com/office/drawing/2016/5/14/chartex" xmlns:mc="http://schemas.openxmlformats.org/markup-compatibility/2006" xmlns:aink="http://schemas.microsoft.com/office/drawing/2016/ink" xmlns:am3d="http://schemas.microsoft.com/office/drawing/2017/model3d" xmlns:o="urn:schemas-microsoft-com:office:office" xmlns:oel="http://schemas.microsoft.com/office/2019/extlst" xmlns:r="http://schemas.openxmlformats.org/officeDocument/2006/relationships" xmlns:m="http://schemas.openxmlformats.org/officeDocument/2006/math" xmlns:v="urn:schemas-microsoft-com:vml" xmlns:wp14="http://schemas.microsoft.com/office/word/2010/wordprocessingDrawing" xmlns:wp="http://schemas.openxmlformats.org/drawingml/2006/wordprocessingDrawing" xmlns:w10="urn:schemas-microsoft-com:office:word" xmlns:w="http://schemas.openxmlformats.org/wordprocessingml/2006/main" xmlns:w14="http://schemas.microsoft.com/office/word/2010/wordml" xmlns:w15="http://schemas.microsoft.com/office/word/2012/wordml" xmlns:w16cei="http://schemas.microsoft.com/office/word/2026/wordml/cei" xmlns:w16cex="http://schemas.microsoft.com/office/word/2018/wordml/cex" xmlns:w16cid="http://schemas.microsoft.com/office/word/2016/wordml/cid" xmlns:w16="http://schemas.microsoft.com/office/word/2018/wordml" xmlns:w16du="http://schemas.microsoft.com/office/word/2023/wordml/word16du" xmlns:w16sdtdh="http://schemas.microsoft.com/office/word/2020/wordml/sdtdatahash" xmlns:w16sdtfl="http://schemas.microsoft.com/office/word/2024/wordml/sdtformatlock" xmlns:w16se="http://schemas.microsoft.com/office/word/2015/wordml/symex" xmlns:wpg="http://schemas.microsoft.com/office/word/2010/wordprocessingGroup" xmlns:wpi="http://schemas.microsoft.com/office/word/2010/wordprocessingInk" xmlns:wne="http://schemas.microsoft.com/office/word/2006/wordml" xmlns:wps="http://schemas.microsoft.com/office/word/2010/wordprocessingShape" mc:Ignorable="w14 w15 w16se w16cid w16 w16cex w16sdtdh w16sdtfl w16du wp14">
   <w:body>
+    <w:p>
+      <w:r>
+        <w:t xml:space="preserve">Here is the complete, updated </w:t>
+      </w:r>
+      <w:r>
+        <w:rPr>
+          <w:b/>
+          <w:bCs/>
+        </w:rPr>
+        <w:t>Pattern Registry</w:t>
+      </w:r>
+      <w:r>
+        <w:t xml:space="preserve"> incorporating the 6 new patterns (</w:t>
+      </w:r>
+      <w:r>
+        <w:rPr>
+          <w:b/>
+          <w:bCs/>
+        </w:rPr>
+        <w:t>PAT-021</w:t>
+      </w:r>
+      <w:r>
+        <w:t xml:space="preserve"> through </w:t>
+      </w:r>
+      <w:r>
+        <w:rPr>
+          <w:b/>
+          <w:bCs/>
+        </w:rPr>
+        <w:t>PAT-026</w:t>
+      </w:r>
+      <w:r>
+        <w:t xml:space="preserve">), bringing the total pattern count to </w:t>
+      </w:r>
+      <w:r>
+        <w:rPr>
+          <w:b/>
+          <w:bCs/>
+        </w:rPr>
+        <w:t>26</w:t>
+      </w:r>
+      <w:r>
+        <w:t>.</w:t>
+      </w:r>
+    </w:p>
     <w:p>
       <w:pPr>
         <w:rPr>
@@ -70,7 +115,7 @@
         <w:tblLook w:val="04A0" w:firstRow="1" w:lastRow="0" w:firstColumn="1" w:lastColumn="0" w:noHBand="0" w:noVBand="1"/>
       </w:tblPr>
       <w:tblGrid>
-        <w:gridCol w:w="1671"/>
+        <w:gridCol w:w="1759"/>
         <w:gridCol w:w="6495"/>
       </w:tblGrid>
       <w:tr>
@@ -159,6 +204,10 @@
           </w:tcPr>
           <w:p>
             <w:r>
+              <w:rPr>
+                <w:b/>
+                <w:bCs/>
+              </w:rPr>
               <w:t>PTID</w:t>
             </w:r>
           </w:p>
@@ -212,6 +261,10 @@
           </w:tcPr>
           <w:p>
             <w:r>
+              <w:rPr>
+                <w:b/>
+                <w:bCs/>
+              </w:rPr>
               <w:t>Pattern Title</w:t>
             </w:r>
           </w:p>
@@ -265,6 +318,10 @@
           </w:tcPr>
           <w:p>
             <w:r>
+              <w:rPr>
+                <w:b/>
+                <w:bCs/>
+              </w:rPr>
               <w:t>Status</w:t>
             </w:r>
           </w:p>
@@ -295,14 +352,6 @@
         </w:tc>
       </w:tr>
     </w:tbl>
-    <w:p>
-      <w:pPr>
-        <w:rPr>
-          <w:b/>
-          <w:bCs/>
-        </w:rPr>
-      </w:pPr>
-    </w:p>
     <w:p>
       <w:pPr>
         <w:rPr>
@@ -331,7 +380,7 @@
         <w:tblLook w:val="04A0" w:firstRow="1" w:lastRow="0" w:firstColumn="1" w:lastColumn="0" w:noHBand="0" w:noVBand="1"/>
       </w:tblPr>
       <w:tblGrid>
-        <w:gridCol w:w="1260"/>
+        <w:gridCol w:w="1283"/>
         <w:gridCol w:w="4138"/>
         <w:gridCol w:w="1516"/>
       </w:tblGrid>
@@ -449,6 +498,10 @@
           </w:tcPr>
           <w:p>
             <w:r>
+              <w:rPr>
+                <w:b/>
+                <w:bCs/>
+              </w:rPr>
               <w:t>PAT-001</w:t>
             </w:r>
           </w:p>
@@ -526,6 +579,10 @@
           </w:tcPr>
           <w:p>
             <w:r>
+              <w:rPr>
+                <w:b/>
+                <w:bCs/>
+              </w:rPr>
               <w:t>PAT-002</w:t>
             </w:r>
           </w:p>
@@ -603,6 +660,10 @@
           </w:tcPr>
           <w:p>
             <w:r>
+              <w:rPr>
+                <w:b/>
+                <w:bCs/>
+              </w:rPr>
               <w:t>PAT-003</w:t>
             </w:r>
           </w:p>
@@ -680,6 +741,10 @@
           </w:tcPr>
           <w:p>
             <w:r>
+              <w:rPr>
+                <w:b/>
+                <w:bCs/>
+              </w:rPr>
               <w:t>PAT-004</w:t>
             </w:r>
           </w:p>
@@ -757,6 +822,10 @@
           </w:tcPr>
           <w:p>
             <w:r>
+              <w:rPr>
+                <w:b/>
+                <w:bCs/>
+              </w:rPr>
               <w:t>PAT-005</w:t>
             </w:r>
           </w:p>
@@ -834,6 +903,10 @@
           </w:tcPr>
           <w:p>
             <w:r>
+              <w:rPr>
+                <w:b/>
+                <w:bCs/>
+              </w:rPr>
               <w:lastRenderedPageBreak/>
               <w:t>PAT-006</w:t>
             </w:r>
@@ -912,6 +985,10 @@
           </w:tcPr>
           <w:p>
             <w:r>
+              <w:rPr>
+                <w:b/>
+                <w:bCs/>
+              </w:rPr>
               <w:t>PAT-007</w:t>
             </w:r>
           </w:p>
@@ -989,6 +1066,10 @@
           </w:tcPr>
           <w:p>
             <w:r>
+              <w:rPr>
+                <w:b/>
+                <w:bCs/>
+              </w:rPr>
               <w:t>PAT-008</w:t>
             </w:r>
           </w:p>
@@ -1066,6 +1147,10 @@
           </w:tcPr>
           <w:p>
             <w:r>
+              <w:rPr>
+                <w:b/>
+                <w:bCs/>
+              </w:rPr>
               <w:t>PAT-009</w:t>
             </w:r>
           </w:p>
@@ -1143,6 +1228,10 @@
           </w:tcPr>
           <w:p>
             <w:r>
+              <w:rPr>
+                <w:b/>
+                <w:bCs/>
+              </w:rPr>
               <w:t>PAT-010</w:t>
             </w:r>
           </w:p>
@@ -1220,6 +1309,10 @@
           </w:tcPr>
           <w:p>
             <w:r>
+              <w:rPr>
+                <w:b/>
+                <w:bCs/>
+              </w:rPr>
               <w:t>PAT-011</w:t>
             </w:r>
           </w:p>
@@ -1297,6 +1390,10 @@
           </w:tcPr>
           <w:p>
             <w:r>
+              <w:rPr>
+                <w:b/>
+                <w:bCs/>
+              </w:rPr>
               <w:t>PAT-012</w:t>
             </w:r>
           </w:p>
@@ -1374,6 +1471,10 @@
           </w:tcPr>
           <w:p>
             <w:r>
+              <w:rPr>
+                <w:b/>
+                <w:bCs/>
+              </w:rPr>
               <w:t>PAT-013</w:t>
             </w:r>
           </w:p>
@@ -1451,6 +1552,10 @@
           </w:tcPr>
           <w:p>
             <w:r>
+              <w:rPr>
+                <w:b/>
+                <w:bCs/>
+              </w:rPr>
               <w:t>PAT-014</w:t>
             </w:r>
           </w:p>
@@ -1528,6 +1633,10 @@
           </w:tcPr>
           <w:p>
             <w:r>
+              <w:rPr>
+                <w:b/>
+                <w:bCs/>
+              </w:rPr>
               <w:t>PAT-015</w:t>
             </w:r>
           </w:p>
@@ -1605,6 +1714,10 @@
           </w:tcPr>
           <w:p>
             <w:r>
+              <w:rPr>
+                <w:b/>
+                <w:bCs/>
+              </w:rPr>
               <w:t>PAT-016</w:t>
             </w:r>
           </w:p>
@@ -1682,6 +1795,10 @@
           </w:tcPr>
           <w:p>
             <w:r>
+              <w:rPr>
+                <w:b/>
+                <w:bCs/>
+              </w:rPr>
               <w:t>PAT-017</w:t>
             </w:r>
           </w:p>
@@ -1759,6 +1876,10 @@
           </w:tcPr>
           <w:p>
             <w:r>
+              <w:rPr>
+                <w:b/>
+                <w:bCs/>
+              </w:rPr>
               <w:t>PAT-018</w:t>
             </w:r>
           </w:p>
@@ -1836,6 +1957,10 @@
           </w:tcPr>
           <w:p>
             <w:r>
+              <w:rPr>
+                <w:b/>
+                <w:bCs/>
+              </w:rPr>
               <w:t>PAT-019</w:t>
             </w:r>
           </w:p>
@@ -1913,6 +2038,10 @@
           </w:tcPr>
           <w:p>
             <w:r>
+              <w:rPr>
+                <w:b/>
+                <w:bCs/>
+              </w:rPr>
               <w:t>PAT-020</w:t>
             </w:r>
           </w:p>
@@ -1938,6 +2067,506 @@
           <w:p>
             <w:r>
               <w:t>System Reasoning</w:t>
+            </w:r>
+          </w:p>
+        </w:tc>
+        <w:tc>
+          <w:tcPr>
+            <w:tcW w:w="0" w:type="auto"/>
+            <w:tcBorders>
+              <w:top w:val="single" w:sz="6" w:space="0" w:color="C4C7C5"/>
+              <w:left w:val="single" w:sz="6" w:space="0" w:color="C4C7C5"/>
+              <w:bottom w:val="single" w:sz="6" w:space="0" w:color="C4C7C5"/>
+              <w:right w:val="single" w:sz="6" w:space="0" w:color="C4C7C5"/>
+            </w:tcBorders>
+            <w:tcMar>
+              <w:top w:w="120" w:type="dxa"/>
+              <w:left w:w="180" w:type="dxa"/>
+              <w:bottom w:w="120" w:type="dxa"/>
+              <w:right w:w="180" w:type="dxa"/>
+            </w:tcMar>
+            <w:vAlign w:val="center"/>
+            <w:hideMark/>
+          </w:tcPr>
+          <w:p>
+            <w:r>
+              <w:t>Candidate</w:t>
+            </w:r>
+          </w:p>
+        </w:tc>
+      </w:tr>
+      <w:tr>
+        <w:trPr>
+          <w:tblCellSpacing w:w="15" w:type="dxa"/>
+        </w:trPr>
+        <w:tc>
+          <w:tcPr>
+            <w:tcW w:w="0" w:type="auto"/>
+            <w:tcBorders>
+              <w:top w:val="single" w:sz="6" w:space="0" w:color="C4C7C5"/>
+              <w:left w:val="single" w:sz="6" w:space="0" w:color="C4C7C5"/>
+              <w:bottom w:val="single" w:sz="6" w:space="0" w:color="C4C7C5"/>
+              <w:right w:val="single" w:sz="6" w:space="0" w:color="C4C7C5"/>
+            </w:tcBorders>
+            <w:tcMar>
+              <w:top w:w="120" w:type="dxa"/>
+              <w:left w:w="180" w:type="dxa"/>
+              <w:bottom w:w="120" w:type="dxa"/>
+              <w:right w:w="180" w:type="dxa"/>
+            </w:tcMar>
+            <w:vAlign w:val="center"/>
+            <w:hideMark/>
+          </w:tcPr>
+          <w:p>
+            <w:r>
+              <w:rPr>
+                <w:b/>
+                <w:bCs/>
+              </w:rPr>
+              <w:t>PAT-021</w:t>
+            </w:r>
+          </w:p>
+        </w:tc>
+        <w:tc>
+          <w:tcPr>
+            <w:tcW w:w="0" w:type="auto"/>
+            <w:tcBorders>
+              <w:top w:val="single" w:sz="6" w:space="0" w:color="C4C7C5"/>
+              <w:left w:val="single" w:sz="6" w:space="0" w:color="C4C7C5"/>
+              <w:bottom w:val="single" w:sz="6" w:space="0" w:color="C4C7C5"/>
+              <w:right w:val="single" w:sz="6" w:space="0" w:color="C4C7C5"/>
+            </w:tcBorders>
+            <w:tcMar>
+              <w:top w:w="120" w:type="dxa"/>
+              <w:left w:w="180" w:type="dxa"/>
+              <w:bottom w:w="120" w:type="dxa"/>
+              <w:right w:w="180" w:type="dxa"/>
+            </w:tcMar>
+            <w:vAlign w:val="center"/>
+            <w:hideMark/>
+          </w:tcPr>
+          <w:p>
+            <w:r>
+              <w:t>Task-Centric Work Management</w:t>
+            </w:r>
+          </w:p>
+        </w:tc>
+        <w:tc>
+          <w:tcPr>
+            <w:tcW w:w="0" w:type="auto"/>
+            <w:tcBorders>
+              <w:top w:val="single" w:sz="6" w:space="0" w:color="C4C7C5"/>
+              <w:left w:val="single" w:sz="6" w:space="0" w:color="C4C7C5"/>
+              <w:bottom w:val="single" w:sz="6" w:space="0" w:color="C4C7C5"/>
+              <w:right w:val="single" w:sz="6" w:space="0" w:color="C4C7C5"/>
+            </w:tcBorders>
+            <w:tcMar>
+              <w:top w:w="120" w:type="dxa"/>
+              <w:left w:w="180" w:type="dxa"/>
+              <w:bottom w:w="120" w:type="dxa"/>
+              <w:right w:w="180" w:type="dxa"/>
+            </w:tcMar>
+            <w:vAlign w:val="center"/>
+            <w:hideMark/>
+          </w:tcPr>
+          <w:p>
+            <w:r>
+              <w:t>Candidate</w:t>
+            </w:r>
+          </w:p>
+        </w:tc>
+      </w:tr>
+      <w:tr>
+        <w:trPr>
+          <w:tblCellSpacing w:w="15" w:type="dxa"/>
+        </w:trPr>
+        <w:tc>
+          <w:tcPr>
+            <w:tcW w:w="0" w:type="auto"/>
+            <w:tcBorders>
+              <w:top w:val="single" w:sz="6" w:space="0" w:color="C4C7C5"/>
+              <w:left w:val="single" w:sz="6" w:space="0" w:color="C4C7C5"/>
+              <w:bottom w:val="single" w:sz="6" w:space="0" w:color="C4C7C5"/>
+              <w:right w:val="single" w:sz="6" w:space="0" w:color="C4C7C5"/>
+            </w:tcBorders>
+            <w:tcMar>
+              <w:top w:w="120" w:type="dxa"/>
+              <w:left w:w="180" w:type="dxa"/>
+              <w:bottom w:w="120" w:type="dxa"/>
+              <w:right w:w="180" w:type="dxa"/>
+            </w:tcMar>
+            <w:vAlign w:val="center"/>
+            <w:hideMark/>
+          </w:tcPr>
+          <w:p>
+            <w:r>
+              <w:rPr>
+                <w:b/>
+                <w:bCs/>
+              </w:rPr>
+              <w:lastRenderedPageBreak/>
+              <w:t>PAT-022</w:t>
+            </w:r>
+          </w:p>
+        </w:tc>
+        <w:tc>
+          <w:tcPr>
+            <w:tcW w:w="0" w:type="auto"/>
+            <w:tcBorders>
+              <w:top w:val="single" w:sz="6" w:space="0" w:color="C4C7C5"/>
+              <w:left w:val="single" w:sz="6" w:space="0" w:color="C4C7C5"/>
+              <w:bottom w:val="single" w:sz="6" w:space="0" w:color="C4C7C5"/>
+              <w:right w:val="single" w:sz="6" w:space="0" w:color="C4C7C5"/>
+            </w:tcBorders>
+            <w:tcMar>
+              <w:top w:w="120" w:type="dxa"/>
+              <w:left w:w="180" w:type="dxa"/>
+              <w:bottom w:w="120" w:type="dxa"/>
+              <w:right w:w="180" w:type="dxa"/>
+            </w:tcMar>
+            <w:vAlign w:val="center"/>
+            <w:hideMark/>
+          </w:tcPr>
+          <w:p>
+            <w:r>
+              <w:t>Context Continuity</w:t>
+            </w:r>
+          </w:p>
+        </w:tc>
+        <w:tc>
+          <w:tcPr>
+            <w:tcW w:w="0" w:type="auto"/>
+            <w:tcBorders>
+              <w:top w:val="single" w:sz="6" w:space="0" w:color="C4C7C5"/>
+              <w:left w:val="single" w:sz="6" w:space="0" w:color="C4C7C5"/>
+              <w:bottom w:val="single" w:sz="6" w:space="0" w:color="C4C7C5"/>
+              <w:right w:val="single" w:sz="6" w:space="0" w:color="C4C7C5"/>
+            </w:tcBorders>
+            <w:tcMar>
+              <w:top w:w="120" w:type="dxa"/>
+              <w:left w:w="180" w:type="dxa"/>
+              <w:bottom w:w="120" w:type="dxa"/>
+              <w:right w:w="180" w:type="dxa"/>
+            </w:tcMar>
+            <w:vAlign w:val="center"/>
+            <w:hideMark/>
+          </w:tcPr>
+          <w:p>
+            <w:r>
+              <w:t>Candidate</w:t>
+            </w:r>
+          </w:p>
+        </w:tc>
+      </w:tr>
+      <w:tr>
+        <w:trPr>
+          <w:tblCellSpacing w:w="15" w:type="dxa"/>
+        </w:trPr>
+        <w:tc>
+          <w:tcPr>
+            <w:tcW w:w="0" w:type="auto"/>
+            <w:tcBorders>
+              <w:top w:val="single" w:sz="6" w:space="0" w:color="C4C7C5"/>
+              <w:left w:val="single" w:sz="6" w:space="0" w:color="C4C7C5"/>
+              <w:bottom w:val="single" w:sz="6" w:space="0" w:color="C4C7C5"/>
+              <w:right w:val="single" w:sz="6" w:space="0" w:color="C4C7C5"/>
+            </w:tcBorders>
+            <w:tcMar>
+              <w:top w:w="120" w:type="dxa"/>
+              <w:left w:w="180" w:type="dxa"/>
+              <w:bottom w:w="120" w:type="dxa"/>
+              <w:right w:w="180" w:type="dxa"/>
+            </w:tcMar>
+            <w:vAlign w:val="center"/>
+            <w:hideMark/>
+          </w:tcPr>
+          <w:p>
+            <w:r>
+              <w:rPr>
+                <w:b/>
+                <w:bCs/>
+              </w:rPr>
+              <w:t>PAT-023</w:t>
+            </w:r>
+          </w:p>
+        </w:tc>
+        <w:tc>
+          <w:tcPr>
+            <w:tcW w:w="0" w:type="auto"/>
+            <w:tcBorders>
+              <w:top w:val="single" w:sz="6" w:space="0" w:color="C4C7C5"/>
+              <w:left w:val="single" w:sz="6" w:space="0" w:color="C4C7C5"/>
+              <w:bottom w:val="single" w:sz="6" w:space="0" w:color="C4C7C5"/>
+              <w:right w:val="single" w:sz="6" w:space="0" w:color="C4C7C5"/>
+            </w:tcBorders>
+            <w:tcMar>
+              <w:top w:w="120" w:type="dxa"/>
+              <w:left w:w="180" w:type="dxa"/>
+              <w:bottom w:w="120" w:type="dxa"/>
+              <w:right w:w="180" w:type="dxa"/>
+            </w:tcMar>
+            <w:vAlign w:val="center"/>
+            <w:hideMark/>
+          </w:tcPr>
+          <w:p>
+            <w:r>
+              <w:t xml:space="preserve">Adaptive System </w:t>
+            </w:r>
+            <w:proofErr w:type="spellStart"/>
+            <w:r>
+              <w:t>Behavior</w:t>
+            </w:r>
+            <w:proofErr w:type="spellEnd"/>
+          </w:p>
+        </w:tc>
+        <w:tc>
+          <w:tcPr>
+            <w:tcW w:w="0" w:type="auto"/>
+            <w:tcBorders>
+              <w:top w:val="single" w:sz="6" w:space="0" w:color="C4C7C5"/>
+              <w:left w:val="single" w:sz="6" w:space="0" w:color="C4C7C5"/>
+              <w:bottom w:val="single" w:sz="6" w:space="0" w:color="C4C7C5"/>
+              <w:right w:val="single" w:sz="6" w:space="0" w:color="C4C7C5"/>
+            </w:tcBorders>
+            <w:tcMar>
+              <w:top w:w="120" w:type="dxa"/>
+              <w:left w:w="180" w:type="dxa"/>
+              <w:bottom w:w="120" w:type="dxa"/>
+              <w:right w:w="180" w:type="dxa"/>
+            </w:tcMar>
+            <w:vAlign w:val="center"/>
+            <w:hideMark/>
+          </w:tcPr>
+          <w:p>
+            <w:r>
+              <w:t>Candidate</w:t>
+            </w:r>
+          </w:p>
+        </w:tc>
+      </w:tr>
+      <w:tr>
+        <w:trPr>
+          <w:tblCellSpacing w:w="15" w:type="dxa"/>
+        </w:trPr>
+        <w:tc>
+          <w:tcPr>
+            <w:tcW w:w="0" w:type="auto"/>
+            <w:tcBorders>
+              <w:top w:val="single" w:sz="6" w:space="0" w:color="C4C7C5"/>
+              <w:left w:val="single" w:sz="6" w:space="0" w:color="C4C7C5"/>
+              <w:bottom w:val="single" w:sz="6" w:space="0" w:color="C4C7C5"/>
+              <w:right w:val="single" w:sz="6" w:space="0" w:color="C4C7C5"/>
+            </w:tcBorders>
+            <w:tcMar>
+              <w:top w:w="120" w:type="dxa"/>
+              <w:left w:w="180" w:type="dxa"/>
+              <w:bottom w:w="120" w:type="dxa"/>
+              <w:right w:w="180" w:type="dxa"/>
+            </w:tcMar>
+            <w:vAlign w:val="center"/>
+            <w:hideMark/>
+          </w:tcPr>
+          <w:p>
+            <w:r>
+              <w:rPr>
+                <w:b/>
+                <w:bCs/>
+              </w:rPr>
+              <w:t>PAT-024</w:t>
+            </w:r>
+          </w:p>
+        </w:tc>
+        <w:tc>
+          <w:tcPr>
+            <w:tcW w:w="0" w:type="auto"/>
+            <w:tcBorders>
+              <w:top w:val="single" w:sz="6" w:space="0" w:color="C4C7C5"/>
+              <w:left w:val="single" w:sz="6" w:space="0" w:color="C4C7C5"/>
+              <w:bottom w:val="single" w:sz="6" w:space="0" w:color="C4C7C5"/>
+              <w:right w:val="single" w:sz="6" w:space="0" w:color="C4C7C5"/>
+            </w:tcBorders>
+            <w:tcMar>
+              <w:top w:w="120" w:type="dxa"/>
+              <w:left w:w="180" w:type="dxa"/>
+              <w:bottom w:w="120" w:type="dxa"/>
+              <w:right w:w="180" w:type="dxa"/>
+            </w:tcMar>
+            <w:vAlign w:val="center"/>
+            <w:hideMark/>
+          </w:tcPr>
+          <w:p>
+            <w:r>
+              <w:t>Human-</w:t>
+            </w:r>
+            <w:proofErr w:type="spellStart"/>
+            <w:r>
+              <w:t>Centered</w:t>
+            </w:r>
+            <w:proofErr w:type="spellEnd"/>
+            <w:r>
+              <w:t xml:space="preserve"> Computing</w:t>
+            </w:r>
+          </w:p>
+        </w:tc>
+        <w:tc>
+          <w:tcPr>
+            <w:tcW w:w="0" w:type="auto"/>
+            <w:tcBorders>
+              <w:top w:val="single" w:sz="6" w:space="0" w:color="C4C7C5"/>
+              <w:left w:val="single" w:sz="6" w:space="0" w:color="C4C7C5"/>
+              <w:bottom w:val="single" w:sz="6" w:space="0" w:color="C4C7C5"/>
+              <w:right w:val="single" w:sz="6" w:space="0" w:color="C4C7C5"/>
+            </w:tcBorders>
+            <w:tcMar>
+              <w:top w:w="120" w:type="dxa"/>
+              <w:left w:w="180" w:type="dxa"/>
+              <w:bottom w:w="120" w:type="dxa"/>
+              <w:right w:w="180" w:type="dxa"/>
+            </w:tcMar>
+            <w:vAlign w:val="center"/>
+            <w:hideMark/>
+          </w:tcPr>
+          <w:p>
+            <w:r>
+              <w:t>Candidate</w:t>
+            </w:r>
+          </w:p>
+        </w:tc>
+      </w:tr>
+      <w:tr>
+        <w:trPr>
+          <w:tblCellSpacing w:w="15" w:type="dxa"/>
+        </w:trPr>
+        <w:tc>
+          <w:tcPr>
+            <w:tcW w:w="0" w:type="auto"/>
+            <w:tcBorders>
+              <w:top w:val="single" w:sz="6" w:space="0" w:color="C4C7C5"/>
+              <w:left w:val="single" w:sz="6" w:space="0" w:color="C4C7C5"/>
+              <w:bottom w:val="single" w:sz="6" w:space="0" w:color="C4C7C5"/>
+              <w:right w:val="single" w:sz="6" w:space="0" w:color="C4C7C5"/>
+            </w:tcBorders>
+            <w:tcMar>
+              <w:top w:w="120" w:type="dxa"/>
+              <w:left w:w="180" w:type="dxa"/>
+              <w:bottom w:w="120" w:type="dxa"/>
+              <w:right w:w="180" w:type="dxa"/>
+            </w:tcMar>
+            <w:vAlign w:val="center"/>
+            <w:hideMark/>
+          </w:tcPr>
+          <w:p>
+            <w:r>
+              <w:rPr>
+                <w:b/>
+                <w:bCs/>
+              </w:rPr>
+              <w:t>PAT-025</w:t>
+            </w:r>
+          </w:p>
+        </w:tc>
+        <w:tc>
+          <w:tcPr>
+            <w:tcW w:w="0" w:type="auto"/>
+            <w:tcBorders>
+              <w:top w:val="single" w:sz="6" w:space="0" w:color="C4C7C5"/>
+              <w:left w:val="single" w:sz="6" w:space="0" w:color="C4C7C5"/>
+              <w:bottom w:val="single" w:sz="6" w:space="0" w:color="C4C7C5"/>
+              <w:right w:val="single" w:sz="6" w:space="0" w:color="C4C7C5"/>
+            </w:tcBorders>
+            <w:tcMar>
+              <w:top w:w="120" w:type="dxa"/>
+              <w:left w:w="180" w:type="dxa"/>
+              <w:bottom w:w="120" w:type="dxa"/>
+              <w:right w:w="180" w:type="dxa"/>
+            </w:tcMar>
+            <w:vAlign w:val="center"/>
+            <w:hideMark/>
+          </w:tcPr>
+          <w:p>
+            <w:r>
+              <w:t>Digital Ecosystem Integration</w:t>
+            </w:r>
+          </w:p>
+        </w:tc>
+        <w:tc>
+          <w:tcPr>
+            <w:tcW w:w="0" w:type="auto"/>
+            <w:tcBorders>
+              <w:top w:val="single" w:sz="6" w:space="0" w:color="C4C7C5"/>
+              <w:left w:val="single" w:sz="6" w:space="0" w:color="C4C7C5"/>
+              <w:bottom w:val="single" w:sz="6" w:space="0" w:color="C4C7C5"/>
+              <w:right w:val="single" w:sz="6" w:space="0" w:color="C4C7C5"/>
+            </w:tcBorders>
+            <w:tcMar>
+              <w:top w:w="120" w:type="dxa"/>
+              <w:left w:w="180" w:type="dxa"/>
+              <w:bottom w:w="120" w:type="dxa"/>
+              <w:right w:w="180" w:type="dxa"/>
+            </w:tcMar>
+            <w:vAlign w:val="center"/>
+            <w:hideMark/>
+          </w:tcPr>
+          <w:p>
+            <w:r>
+              <w:t>Candidate</w:t>
+            </w:r>
+          </w:p>
+        </w:tc>
+      </w:tr>
+      <w:tr>
+        <w:trPr>
+          <w:tblCellSpacing w:w="15" w:type="dxa"/>
+        </w:trPr>
+        <w:tc>
+          <w:tcPr>
+            <w:tcW w:w="0" w:type="auto"/>
+            <w:tcBorders>
+              <w:top w:val="single" w:sz="6" w:space="0" w:color="C4C7C5"/>
+              <w:left w:val="single" w:sz="6" w:space="0" w:color="C4C7C5"/>
+              <w:bottom w:val="single" w:sz="6" w:space="0" w:color="C4C7C5"/>
+              <w:right w:val="single" w:sz="6" w:space="0" w:color="C4C7C5"/>
+            </w:tcBorders>
+            <w:tcMar>
+              <w:top w:w="120" w:type="dxa"/>
+              <w:left w:w="180" w:type="dxa"/>
+              <w:bottom w:w="120" w:type="dxa"/>
+              <w:right w:w="180" w:type="dxa"/>
+            </w:tcMar>
+            <w:vAlign w:val="center"/>
+            <w:hideMark/>
+          </w:tcPr>
+          <w:p>
+            <w:r>
+              <w:rPr>
+                <w:b/>
+                <w:bCs/>
+              </w:rPr>
+              <w:t>PAT-026</w:t>
+            </w:r>
+          </w:p>
+        </w:tc>
+        <w:tc>
+          <w:tcPr>
+            <w:tcW w:w="0" w:type="auto"/>
+            <w:tcBorders>
+              <w:top w:val="single" w:sz="6" w:space="0" w:color="C4C7C5"/>
+              <w:left w:val="single" w:sz="6" w:space="0" w:color="C4C7C5"/>
+              <w:bottom w:val="single" w:sz="6" w:space="0" w:color="C4C7C5"/>
+              <w:right w:val="single" w:sz="6" w:space="0" w:color="C4C7C5"/>
+            </w:tcBorders>
+            <w:tcMar>
+              <w:top w:w="120" w:type="dxa"/>
+              <w:left w:w="180" w:type="dxa"/>
+              <w:bottom w:w="120" w:type="dxa"/>
+              <w:right w:w="180" w:type="dxa"/>
+            </w:tcMar>
+            <w:vAlign w:val="center"/>
+            <w:hideMark/>
+          </w:tcPr>
+          <w:p>
+            <w:r>
+              <w:t>Cognitive Offloading</w:t>
             </w:r>
           </w:p>
         </w:tc>
@@ -1967,14 +2596,6 @@
         </w:tc>
       </w:tr>
     </w:tbl>
-    <w:p>
-      <w:pPr>
-        <w:rPr>
-          <w:b/>
-          <w:bCs/>
-        </w:rPr>
-      </w:pPr>
-    </w:p>
     <w:p>
       <w:pPr>
         <w:rPr>
@@ -2003,7 +2624,7 @@
         <w:tblLook w:val="04A0" w:firstRow="1" w:lastRow="0" w:firstColumn="1" w:lastColumn="0" w:noHBand="0" w:noVBand="1"/>
       </w:tblPr>
       <w:tblGrid>
-        <w:gridCol w:w="1844"/>
+        <w:gridCol w:w="1935"/>
         <w:gridCol w:w="1047"/>
       </w:tblGrid>
       <w:tr>
@@ -2035,7 +2656,6 @@
                 <w:b/>
                 <w:bCs/>
               </w:rPr>
-              <w:lastRenderedPageBreak/>
               <w:t>Metric</w:t>
             </w:r>
           </w:p>
@@ -2093,6 +2713,10 @@
           </w:tcPr>
           <w:p>
             <w:r>
+              <w:rPr>
+                <w:b/>
+                <w:bCs/>
+              </w:rPr>
               <w:t>Total Patterns</w:t>
             </w:r>
           </w:p>
@@ -2117,7 +2741,7 @@
           </w:tcPr>
           <w:p>
             <w:r>
-              <w:t>20</w:t>
+              <w:t>26</w:t>
             </w:r>
           </w:p>
         </w:tc>
@@ -2146,6 +2770,10 @@
           </w:tcPr>
           <w:p>
             <w:r>
+              <w:rPr>
+                <w:b/>
+                <w:bCs/>
+              </w:rPr>
               <w:t>Accepted</w:t>
             </w:r>
           </w:p>
@@ -2199,6 +2827,10 @@
           </w:tcPr>
           <w:p>
             <w:r>
+              <w:rPr>
+                <w:b/>
+                <w:bCs/>
+              </w:rPr>
               <w:t>Candidate</w:t>
             </w:r>
           </w:p>
@@ -2223,7 +2855,7 @@
           </w:tcPr>
           <w:p>
             <w:r>
-              <w:t>20</w:t>
+              <w:t>26</w:t>
             </w:r>
           </w:p>
         </w:tc>
@@ -2252,6 +2884,10 @@
           </w:tcPr>
           <w:p>
             <w:r>
+              <w:rPr>
+                <w:b/>
+                <w:bCs/>
+              </w:rPr>
               <w:t>Deprecated</w:t>
             </w:r>
           </w:p>
@@ -2282,22 +2918,6 @@
         </w:tc>
       </w:tr>
     </w:tbl>
-    <w:p>
-      <w:pPr>
-        <w:rPr>
-          <w:b/>
-          <w:bCs/>
-        </w:rPr>
-      </w:pPr>
-    </w:p>
-    <w:p>
-      <w:pPr>
-        <w:rPr>
-          <w:b/>
-          <w:bCs/>
-        </w:rPr>
-      </w:pPr>
-    </w:p>
     <w:p>
       <w:pPr>
         <w:rPr>
@@ -2317,7 +2937,7 @@
       <w:pPr>
         <w:numPr>
           <w:ilvl w:val="0"/>
-          <w:numId w:val="7"/>
+          <w:numId w:val="8"/>
         </w:numPr>
       </w:pPr>
       <w:r>
@@ -2328,7 +2948,7 @@
       <w:pPr>
         <w:numPr>
           <w:ilvl w:val="0"/>
-          <w:numId w:val="7"/>
+          <w:numId w:val="8"/>
         </w:numPr>
       </w:pPr>
       <w:r>
@@ -2339,7 +2959,7 @@
       <w:pPr>
         <w:numPr>
           <w:ilvl w:val="0"/>
-          <w:numId w:val="7"/>
+          <w:numId w:val="8"/>
         </w:numPr>
       </w:pPr>
       <w:r>
@@ -2350,7 +2970,7 @@
       <w:pPr>
         <w:numPr>
           <w:ilvl w:val="0"/>
-          <w:numId w:val="7"/>
+          <w:numId w:val="8"/>
         </w:numPr>
       </w:pPr>
       <w:r>
@@ -2361,7 +2981,7 @@
       <w:pPr>
         <w:numPr>
           <w:ilvl w:val="0"/>
-          <w:numId w:val="7"/>
+          <w:numId w:val="8"/>
         </w:numPr>
       </w:pPr>
       <w:r>
@@ -2372,10 +2992,11 @@
       <w:pPr>
         <w:numPr>
           <w:ilvl w:val="0"/>
-          <w:numId w:val="7"/>
+          <w:numId w:val="8"/>
         </w:numPr>
       </w:pPr>
       <w:r>
+        <w:lastRenderedPageBreak/>
         <w:t>The Pattern Registry serves solely as the authoritative index for identifying and locating Patterns.</w:t>
       </w:r>
     </w:p>
@@ -2383,7 +3004,7 @@
       <w:pPr>
         <w:numPr>
           <w:ilvl w:val="0"/>
-          <w:numId w:val="7"/>
+          <w:numId w:val="8"/>
         </w:numPr>
       </w:pPr>
       <w:r>
@@ -2394,7 +3015,7 @@
       <w:pPr>
         <w:numPr>
           <w:ilvl w:val="0"/>
-          <w:numId w:val="7"/>
+          <w:numId w:val="8"/>
         </w:numPr>
       </w:pPr>
       <w:r>
@@ -2405,36 +3026,12 @@
       <w:pPr>
         <w:numPr>
           <w:ilvl w:val="0"/>
-          <w:numId w:val="7"/>
+          <w:numId w:val="8"/>
         </w:numPr>
       </w:pPr>
       <w:r>
         <w:t>Changes to a Pattern's title or status shall be reflected in this Registry.</w:t>
       </w:r>
-    </w:p>
-    <w:p>
-      <w:pPr>
-        <w:rPr>
-          <w:b/>
-          <w:bCs/>
-        </w:rPr>
-      </w:pPr>
-    </w:p>
-    <w:p>
-      <w:pPr>
-        <w:rPr>
-          <w:b/>
-          <w:bCs/>
-        </w:rPr>
-      </w:pPr>
-    </w:p>
-    <w:p>
-      <w:pPr>
-        <w:rPr>
-          <w:b/>
-          <w:bCs/>
-        </w:rPr>
-      </w:pPr>
     </w:p>
     <w:p>
       <w:pPr>
@@ -2464,7 +3061,7 @@
         <w:tblLook w:val="04A0" w:firstRow="1" w:lastRow="0" w:firstColumn="1" w:lastColumn="0" w:noHBand="0" w:noVBand="1"/>
       </w:tblPr>
       <w:tblGrid>
-        <w:gridCol w:w="2209"/>
+        <w:gridCol w:w="2286"/>
         <w:gridCol w:w="2063"/>
       </w:tblGrid>
       <w:tr>
@@ -2496,7 +3093,6 @@
                 <w:b/>
                 <w:bCs/>
               </w:rPr>
-              <w:lastRenderedPageBreak/>
               <w:t>Field</w:t>
             </w:r>
           </w:p>
@@ -2554,6 +3150,10 @@
           </w:tcPr>
           <w:p>
             <w:r>
+              <w:rPr>
+                <w:b/>
+                <w:bCs/>
+              </w:rPr>
               <w:t>Document Name</w:t>
             </w:r>
           </w:p>
@@ -2607,6 +3207,10 @@
           </w:tcPr>
           <w:p>
             <w:r>
+              <w:rPr>
+                <w:b/>
+                <w:bCs/>
+              </w:rPr>
               <w:t>Repository</w:t>
             </w:r>
           </w:p>
@@ -2660,6 +3264,10 @@
           </w:tcPr>
           <w:p>
             <w:r>
+              <w:rPr>
+                <w:b/>
+                <w:bCs/>
+              </w:rPr>
               <w:t>Version</w:t>
             </w:r>
           </w:p>
@@ -2684,7 +3292,7 @@
           </w:tcPr>
           <w:p>
             <w:r>
-              <w:t>1.2</w:t>
+              <w:t>1.3</w:t>
             </w:r>
           </w:p>
         </w:tc>
@@ -2713,6 +3321,10 @@
           </w:tcPr>
           <w:p>
             <w:r>
+              <w:rPr>
+                <w:b/>
+                <w:bCs/>
+              </w:rPr>
               <w:t>Status</w:t>
             </w:r>
           </w:p>
@@ -2766,6 +3378,10 @@
           </w:tcPr>
           <w:p>
             <w:r>
+              <w:rPr>
+                <w:b/>
+                <w:bCs/>
+              </w:rPr>
               <w:t>Last Updated</w:t>
             </w:r>
           </w:p>
@@ -2790,7 +3406,7 @@
           </w:tcPr>
           <w:p>
             <w:r>
-              <w:t>2026-07-30</w:t>
+              <w:t>2026-07-31</w:t>
             </w:r>
           </w:p>
         </w:tc>
@@ -2808,7 +3424,7 @@
 </file>
 
 <file path=word/numbering.xml><?xml version="1.0" encoding="utf-8"?>
-<w:numbering xmlns:wpc="http://schemas.microsoft.com/office/word/2010/wordprocessingCanvas" xmlns:cx="http://schemas.microsoft.com/office/drawing/2014/chartex" xmlns:cx1="http://schemas.microsoft.com/office/drawing/2015/9/8/chartex" xmlns:cx2="http://schemas.microsoft.com/office/drawing/2015/10/21/chartex" xmlns:cx3="http://schemas.microsoft.com/office/drawing/2016/5/9/chartex" xmlns:cx4="http://schemas.microsoft.com/office/drawing/2016/5/10/chartex" xmlns:cx5="http://schemas.microsoft.com/office/drawing/2016/5/11/chartex" xmlns:cx6="http://schemas.microsoft.com/office/drawing/2016/5/12/chartex" xmlns:cx7="http://schemas.microsoft.com/office/drawing/2016/5/13/chartex" xmlns:cx8="http://schemas.microsoft.com/office/drawing/2016/5/14/chartex" xmlns:mc="http://schemas.openxmlformats.org/markup-compatibility/2006" xmlns:aink="http://schemas.microsoft.com/office/drawing/2016/ink" xmlns:am3d="http://schemas.microsoft.com/office/drawing/2017/model3d" xmlns:o="urn:schemas-microsoft-com:office:office" xmlns:oel="http://schemas.microsoft.com/office/2019/extlst" xmlns:r="http://schemas.openxmlformats.org/officeDocument/2006/relationships" xmlns:m="http://schemas.openxmlformats.org/officeDocument/2006/math" xmlns:v="urn:schemas-microsoft-com:vml" xmlns:wp14="http://schemas.microsoft.com/office/word/2010/wordprocessingDrawing" xmlns:wp="http://schemas.openxmlformats.org/drawingml/2006/wordprocessingDrawing" xmlns:w10="urn:schemas-microsoft-com:office:word" xmlns:w="http://schemas.openxmlformats.org/wordprocessingml/2006/main" xmlns:w14="http://schemas.microsoft.com/office/word/2010/wordml" xmlns:w15="http://schemas.microsoft.com/office/word/2012/wordml" xmlns:w16cex="http://schemas.microsoft.com/office/word/2018/wordml/cex" xmlns:w16cid="http://schemas.microsoft.com/office/word/2016/wordml/cid" xmlns:w16="http://schemas.microsoft.com/office/word/2018/wordml" xmlns:w16du="http://schemas.microsoft.com/office/word/2023/wordml/word16du" xmlns:w16sdtdh="http://schemas.microsoft.com/office/word/2020/wordml/sdtdatahash" xmlns:w16sdtfl="http://schemas.microsoft.com/office/word/2024/wordml/sdtformatlock" xmlns:w16se="http://schemas.microsoft.com/office/word/2015/wordml/symex" xmlns:wpg="http://schemas.microsoft.com/office/word/2010/wordprocessingGroup" xmlns:wpi="http://schemas.microsoft.com/office/word/2010/wordprocessingInk" xmlns:wne="http://schemas.microsoft.com/office/word/2006/wordml" xmlns:wps="http://schemas.microsoft.com/office/word/2010/wordprocessingShape" mc:Ignorable="w14 w15 w16se w16cid w16 w16cex w16sdtdh w16sdtfl w16du wp14">
+<w:numbering xmlns:wpc="http://schemas.microsoft.com/office/word/2010/wordprocessingCanvas" xmlns:cx="http://schemas.microsoft.com/office/drawing/2014/chartex" xmlns:cx1="http://schemas.microsoft.com/office/drawing/2015/9/8/chartex" xmlns:cx2="http://schemas.microsoft.com/office/drawing/2015/10/21/chartex" xmlns:cx3="http://schemas.microsoft.com/office/drawing/2016/5/9/chartex" xmlns:cx4="http://schemas.microsoft.com/office/drawing/2016/5/10/chartex" xmlns:cx5="http://schemas.microsoft.com/office/drawing/2016/5/11/chartex" xmlns:cx6="http://schemas.microsoft.com/office/drawing/2016/5/12/chartex" xmlns:cx7="http://schemas.microsoft.com/office/drawing/2016/5/13/chartex" xmlns:cx8="http://schemas.microsoft.com/office/drawing/2016/5/14/chartex" xmlns:mc="http://schemas.openxmlformats.org/markup-compatibility/2006" xmlns:aink="http://schemas.microsoft.com/office/drawing/2016/ink" xmlns:am3d="http://schemas.microsoft.com/office/drawing/2017/model3d" xmlns:o="urn:schemas-microsoft-com:office:office" xmlns:oel="http://schemas.microsoft.com/office/2019/extlst" xmlns:r="http://schemas.openxmlformats.org/officeDocument/2006/relationships" xmlns:m="http://schemas.openxmlformats.org/officeDocument/2006/math" xmlns:v="urn:schemas-microsoft-com:vml" xmlns:wp14="http://schemas.microsoft.com/office/word/2010/wordprocessingDrawing" xmlns:wp="http://schemas.openxmlformats.org/drawingml/2006/wordprocessingDrawing" xmlns:w10="urn:schemas-microsoft-com:office:word" xmlns:w="http://schemas.openxmlformats.org/wordprocessingml/2006/main" xmlns:w14="http://schemas.microsoft.com/office/word/2010/wordml" xmlns:w15="http://schemas.microsoft.com/office/word/2012/wordml" xmlns:w16cei="http://schemas.microsoft.com/office/word/2026/wordml/cei" xmlns:w16cex="http://schemas.microsoft.com/office/word/2018/wordml/cex" xmlns:w16cid="http://schemas.microsoft.com/office/word/2016/wordml/cid" xmlns:w16="http://schemas.microsoft.com/office/word/2018/wordml" xmlns:w16du="http://schemas.microsoft.com/office/word/2023/wordml/word16du" xmlns:w16sdtdh="http://schemas.microsoft.com/office/word/2020/wordml/sdtdatahash" xmlns:w16sdtfl="http://schemas.microsoft.com/office/word/2024/wordml/sdtformatlock" xmlns:w16se="http://schemas.microsoft.com/office/word/2015/wordml/symex" xmlns:wpg="http://schemas.microsoft.com/office/word/2010/wordprocessingGroup" xmlns:wpi="http://schemas.microsoft.com/office/word/2010/wordprocessingInk" xmlns:wne="http://schemas.microsoft.com/office/word/2006/wordml" xmlns:wps="http://schemas.microsoft.com/office/word/2010/wordprocessingShape" mc:Ignorable="w14 w15 w16se w16cid w16 w16cex w16sdtdh w16sdtfl w16du wp14">
   <w:abstractNum w:abstractNumId="0" w15:restartNumberingAfterBreak="0">
     <w:nsid w:val="15CF4DAE"/>
     <w:multiLevelType w:val="multilevel"/>
@@ -3036,6 +3652,119 @@
     </w:lvl>
   </w:abstractNum>
   <w:abstractNum w:abstractNumId="2" w15:restartNumberingAfterBreak="0">
+    <w:nsid w:val="369D75AC"/>
+    <w:multiLevelType w:val="multilevel"/>
+    <w:tmpl w:val="21D0A75E"/>
+    <w:lvl w:ilvl="0">
+      <w:start w:val="1"/>
+      <w:numFmt w:val="decimal"/>
+      <w:lvlText w:val="%1."/>
+      <w:lvlJc w:val="left"/>
+      <w:pPr>
+        <w:tabs>
+          <w:tab w:val="num" w:pos="720"/>
+        </w:tabs>
+        <w:ind w:left="720" w:hanging="360"/>
+      </w:pPr>
+    </w:lvl>
+    <w:lvl w:ilvl="1" w:tentative="1">
+      <w:start w:val="1"/>
+      <w:numFmt w:val="decimal"/>
+      <w:lvlText w:val="%2."/>
+      <w:lvlJc w:val="left"/>
+      <w:pPr>
+        <w:tabs>
+          <w:tab w:val="num" w:pos="1440"/>
+        </w:tabs>
+        <w:ind w:left="1440" w:hanging="360"/>
+      </w:pPr>
+    </w:lvl>
+    <w:lvl w:ilvl="2" w:tentative="1">
+      <w:start w:val="1"/>
+      <w:numFmt w:val="decimal"/>
+      <w:lvlText w:val="%3."/>
+      <w:lvlJc w:val="left"/>
+      <w:pPr>
+        <w:tabs>
+          <w:tab w:val="num" w:pos="2160"/>
+        </w:tabs>
+        <w:ind w:left="2160" w:hanging="360"/>
+      </w:pPr>
+    </w:lvl>
+    <w:lvl w:ilvl="3" w:tentative="1">
+      <w:start w:val="1"/>
+      <w:numFmt w:val="decimal"/>
+      <w:lvlText w:val="%4."/>
+      <w:lvlJc w:val="left"/>
+      <w:pPr>
+        <w:tabs>
+          <w:tab w:val="num" w:pos="2880"/>
+        </w:tabs>
+        <w:ind w:left="2880" w:hanging="360"/>
+      </w:pPr>
+    </w:lvl>
+    <w:lvl w:ilvl="4" w:tentative="1">
+      <w:start w:val="1"/>
+      <w:numFmt w:val="decimal"/>
+      <w:lvlText w:val="%5."/>
+      <w:lvlJc w:val="left"/>
+      <w:pPr>
+        <w:tabs>
+          <w:tab w:val="num" w:pos="3600"/>
+        </w:tabs>
+        <w:ind w:left="3600" w:hanging="360"/>
+      </w:pPr>
+    </w:lvl>
+    <w:lvl w:ilvl="5" w:tentative="1">
+      <w:start w:val="1"/>
+      <w:numFmt w:val="decimal"/>
+      <w:lvlText w:val="%6."/>
+      <w:lvlJc w:val="left"/>
+      <w:pPr>
+        <w:tabs>
+          <w:tab w:val="num" w:pos="4320"/>
+        </w:tabs>
+        <w:ind w:left="4320" w:hanging="360"/>
+      </w:pPr>
+    </w:lvl>
+    <w:lvl w:ilvl="6" w:tentative="1">
+      <w:start w:val="1"/>
+      <w:numFmt w:val="decimal"/>
+      <w:lvlText w:val="%7."/>
+      <w:lvlJc w:val="left"/>
+      <w:pPr>
+        <w:tabs>
+          <w:tab w:val="num" w:pos="5040"/>
+        </w:tabs>
+        <w:ind w:left="5040" w:hanging="360"/>
+      </w:pPr>
+    </w:lvl>
+    <w:lvl w:ilvl="7" w:tentative="1">
+      <w:start w:val="1"/>
+      <w:numFmt w:val="decimal"/>
+      <w:lvlText w:val="%8."/>
+      <w:lvlJc w:val="left"/>
+      <w:pPr>
+        <w:tabs>
+          <w:tab w:val="num" w:pos="5760"/>
+        </w:tabs>
+        <w:ind w:left="5760" w:hanging="360"/>
+      </w:pPr>
+    </w:lvl>
+    <w:lvl w:ilvl="8" w:tentative="1">
+      <w:start w:val="1"/>
+      <w:numFmt w:val="decimal"/>
+      <w:lvlText w:val="%9."/>
+      <w:lvlJc w:val="left"/>
+      <w:pPr>
+        <w:tabs>
+          <w:tab w:val="num" w:pos="6480"/>
+        </w:tabs>
+        <w:ind w:left="6480" w:hanging="360"/>
+      </w:pPr>
+    </w:lvl>
+  </w:abstractNum>
+  <w:abstractNum w:abstractNumId="3" w15:restartNumberingAfterBreak="0">
     <w:nsid w:val="3916339B"/>
     <w:multiLevelType w:val="multilevel"/>
     <w:tmpl w:val="05A4A862"/>
@@ -3148,7 +3877,7 @@
       </w:pPr>
     </w:lvl>
   </w:abstractNum>
-  <w:abstractNum w:abstractNumId="3" w15:restartNumberingAfterBreak="0">
+  <w:abstractNum w:abstractNumId="4" w15:restartNumberingAfterBreak="0">
     <w:nsid w:val="408E4D5B"/>
     <w:multiLevelType w:val="multilevel"/>
     <w:tmpl w:val="DDA0CF4A"/>
@@ -3261,7 +3990,7 @@
       </w:pPr>
     </w:lvl>
   </w:abstractNum>
-  <w:abstractNum w:abstractNumId="4" w15:restartNumberingAfterBreak="0">
+  <w:abstractNum w:abstractNumId="5" w15:restartNumberingAfterBreak="0">
     <w:nsid w:val="70BB186F"/>
     <w:multiLevelType w:val="multilevel"/>
     <w:tmpl w:val="39225390"/>
@@ -3374,7 +4103,7 @@
       </w:pPr>
     </w:lvl>
   </w:abstractNum>
-  <w:abstractNum w:abstractNumId="5" w15:restartNumberingAfterBreak="0">
+  <w:abstractNum w:abstractNumId="6" w15:restartNumberingAfterBreak="0">
     <w:nsid w:val="71DB38F1"/>
     <w:multiLevelType w:val="multilevel"/>
     <w:tmpl w:val="7D86EB56"/>
@@ -3487,7 +4216,7 @@
       </w:pPr>
     </w:lvl>
   </w:abstractNum>
-  <w:abstractNum w:abstractNumId="6" w15:restartNumberingAfterBreak="0">
+  <w:abstractNum w:abstractNumId="7" w15:restartNumberingAfterBreak="0">
     <w:nsid w:val="75DC39E6"/>
     <w:multiLevelType w:val="multilevel"/>
     <w:tmpl w:val="EC32B9C4"/>
@@ -3604,22 +4333,25 @@
     <w:abstractNumId w:val="1"/>
   </w:num>
   <w:num w:numId="2" w16cid:durableId="134880570">
-    <w:abstractNumId w:val="4"/>
+    <w:abstractNumId w:val="5"/>
   </w:num>
   <w:num w:numId="3" w16cid:durableId="298078257">
-    <w:abstractNumId w:val="6"/>
+    <w:abstractNumId w:val="7"/>
   </w:num>
   <w:num w:numId="4" w16cid:durableId="669992744">
-    <w:abstractNumId w:val="2"/>
+    <w:abstractNumId w:val="3"/>
   </w:num>
   <w:num w:numId="5" w16cid:durableId="1786999754">
-    <w:abstractNumId w:val="3"/>
+    <w:abstractNumId w:val="4"/>
   </w:num>
   <w:num w:numId="6" w16cid:durableId="286855976">
     <w:abstractNumId w:val="0"/>
   </w:num>
   <w:num w:numId="7" w16cid:durableId="1991785932">
-    <w:abstractNumId w:val="5"/>
+    <w:abstractNumId w:val="6"/>
+  </w:num>
+  <w:num w:numId="8" w16cid:durableId="851458950">
+    <w:abstractNumId w:val="2"/>
   </w:num>
 </w:numbering>
 </file>

</xml_diff>

<commit_message>
Organize pattern docs into volume folders
Move many PAT-*.docx files into Volume 01–05 subfolders (Cognitive Behaviour, Knowledge & Information Behaviour, System Behaviour & Interaction, Interface & Navigation Behaviour, Trust/Privacy/Identity). Add Pattern Volume Registry.docx.docx and new pattern files PAT-044, PAT-045, PAT-046. Update atlas/Registries/Pattern-Registry.docx and atlas/metrics/Pattern Metrics.docx to reflect the reorganization.
</commit_message>
<xml_diff>
--- a/atlas/Registries/Pattern-Registry.docx
+++ b/atlas/Registries/Pattern-Registry.docx
@@ -3928,6 +3928,258 @@
           </w:p>
         </w:tc>
       </w:tr>
+      <w:tr>
+        <w:trPr>
+          <w:tblCellSpacing w:w="15" w:type="dxa"/>
+        </w:trPr>
+        <w:tc>
+          <w:tcPr>
+            <w:tcW w:w="0" w:type="auto"/>
+            <w:tcBorders>
+              <w:top w:val="single" w:sz="6" w:space="0" w:color="C4C7C5"/>
+              <w:left w:val="single" w:sz="6" w:space="0" w:color="C4C7C5"/>
+              <w:bottom w:val="single" w:sz="6" w:space="0" w:color="C4C7C5"/>
+              <w:right w:val="single" w:sz="6" w:space="0" w:color="C4C7C5"/>
+            </w:tcBorders>
+            <w:tcMar>
+              <w:top w:w="120" w:type="dxa"/>
+              <w:left w:w="180" w:type="dxa"/>
+              <w:bottom w:w="120" w:type="dxa"/>
+              <w:right w:w="180" w:type="dxa"/>
+            </w:tcMar>
+            <w:vAlign w:val="center"/>
+          </w:tcPr>
+          <w:p>
+            <w:pPr>
+              <w:rPr>
+                <w:b/>
+                <w:bCs/>
+              </w:rPr>
+            </w:pPr>
+            <w:r>
+              <w:rPr>
+                <w:b/>
+                <w:bCs/>
+              </w:rPr>
+              <w:t>PAT-044</w:t>
+            </w:r>
+          </w:p>
+        </w:tc>
+        <w:tc>
+          <w:tcPr>
+            <w:tcW w:w="0" w:type="auto"/>
+            <w:tcBorders>
+              <w:top w:val="single" w:sz="6" w:space="0" w:color="C4C7C5"/>
+              <w:left w:val="single" w:sz="6" w:space="0" w:color="C4C7C5"/>
+              <w:bottom w:val="single" w:sz="6" w:space="0" w:color="C4C7C5"/>
+              <w:right w:val="single" w:sz="6" w:space="0" w:color="C4C7C5"/>
+            </w:tcBorders>
+            <w:tcMar>
+              <w:top w:w="120" w:type="dxa"/>
+              <w:left w:w="180" w:type="dxa"/>
+              <w:bottom w:w="120" w:type="dxa"/>
+              <w:right w:w="180" w:type="dxa"/>
+            </w:tcMar>
+            <w:vAlign w:val="center"/>
+          </w:tcPr>
+          <w:p>
+            <w:r>
+              <w:t>Workspace Adaptation</w:t>
+            </w:r>
+          </w:p>
+        </w:tc>
+        <w:tc>
+          <w:tcPr>
+            <w:tcW w:w="0" w:type="auto"/>
+            <w:tcBorders>
+              <w:top w:val="single" w:sz="6" w:space="0" w:color="C4C7C5"/>
+              <w:left w:val="single" w:sz="6" w:space="0" w:color="C4C7C5"/>
+              <w:bottom w:val="single" w:sz="6" w:space="0" w:color="C4C7C5"/>
+              <w:right w:val="single" w:sz="6" w:space="0" w:color="C4C7C5"/>
+            </w:tcBorders>
+            <w:tcMar>
+              <w:top w:w="120" w:type="dxa"/>
+              <w:left w:w="180" w:type="dxa"/>
+              <w:bottom w:w="120" w:type="dxa"/>
+              <w:right w:w="180" w:type="dxa"/>
+            </w:tcMar>
+            <w:vAlign w:val="center"/>
+          </w:tcPr>
+          <w:p>
+            <w:r>
+              <w:t>Accepted</w:t>
+            </w:r>
+          </w:p>
+        </w:tc>
+      </w:tr>
+      <w:tr>
+        <w:trPr>
+          <w:tblCellSpacing w:w="15" w:type="dxa"/>
+        </w:trPr>
+        <w:tc>
+          <w:tcPr>
+            <w:tcW w:w="0" w:type="auto"/>
+            <w:tcBorders>
+              <w:top w:val="single" w:sz="6" w:space="0" w:color="C4C7C5"/>
+              <w:left w:val="single" w:sz="6" w:space="0" w:color="C4C7C5"/>
+              <w:bottom w:val="single" w:sz="6" w:space="0" w:color="C4C7C5"/>
+              <w:right w:val="single" w:sz="6" w:space="0" w:color="C4C7C5"/>
+            </w:tcBorders>
+            <w:tcMar>
+              <w:top w:w="120" w:type="dxa"/>
+              <w:left w:w="180" w:type="dxa"/>
+              <w:bottom w:w="120" w:type="dxa"/>
+              <w:right w:w="180" w:type="dxa"/>
+            </w:tcMar>
+            <w:vAlign w:val="center"/>
+          </w:tcPr>
+          <w:p>
+            <w:pPr>
+              <w:rPr>
+                <w:b/>
+                <w:bCs/>
+              </w:rPr>
+            </w:pPr>
+            <w:r>
+              <w:rPr>
+                <w:b/>
+                <w:bCs/>
+              </w:rPr>
+              <w:t>PAT-045</w:t>
+            </w:r>
+          </w:p>
+        </w:tc>
+        <w:tc>
+          <w:tcPr>
+            <w:tcW w:w="0" w:type="auto"/>
+            <w:tcBorders>
+              <w:top w:val="single" w:sz="6" w:space="0" w:color="C4C7C5"/>
+              <w:left w:val="single" w:sz="6" w:space="0" w:color="C4C7C5"/>
+              <w:bottom w:val="single" w:sz="6" w:space="0" w:color="C4C7C5"/>
+              <w:right w:val="single" w:sz="6" w:space="0" w:color="C4C7C5"/>
+            </w:tcBorders>
+            <w:tcMar>
+              <w:top w:w="120" w:type="dxa"/>
+              <w:left w:w="180" w:type="dxa"/>
+              <w:bottom w:w="120" w:type="dxa"/>
+              <w:right w:w="180" w:type="dxa"/>
+            </w:tcMar>
+            <w:vAlign w:val="center"/>
+          </w:tcPr>
+          <w:p>
+            <w:r>
+              <w:t>Information Co-Visualization</w:t>
+            </w:r>
+          </w:p>
+        </w:tc>
+        <w:tc>
+          <w:tcPr>
+            <w:tcW w:w="0" w:type="auto"/>
+            <w:tcBorders>
+              <w:top w:val="single" w:sz="6" w:space="0" w:color="C4C7C5"/>
+              <w:left w:val="single" w:sz="6" w:space="0" w:color="C4C7C5"/>
+              <w:bottom w:val="single" w:sz="6" w:space="0" w:color="C4C7C5"/>
+              <w:right w:val="single" w:sz="6" w:space="0" w:color="C4C7C5"/>
+            </w:tcBorders>
+            <w:tcMar>
+              <w:top w:w="120" w:type="dxa"/>
+              <w:left w:w="180" w:type="dxa"/>
+              <w:bottom w:w="120" w:type="dxa"/>
+              <w:right w:w="180" w:type="dxa"/>
+            </w:tcMar>
+            <w:vAlign w:val="center"/>
+          </w:tcPr>
+          <w:p>
+            <w:r>
+              <w:t>Accepted</w:t>
+            </w:r>
+          </w:p>
+        </w:tc>
+      </w:tr>
+      <w:tr>
+        <w:trPr>
+          <w:tblCellSpacing w:w="15" w:type="dxa"/>
+        </w:trPr>
+        <w:tc>
+          <w:tcPr>
+            <w:tcW w:w="0" w:type="auto"/>
+            <w:tcBorders>
+              <w:top w:val="single" w:sz="6" w:space="0" w:color="C4C7C5"/>
+              <w:left w:val="single" w:sz="6" w:space="0" w:color="C4C7C5"/>
+              <w:bottom w:val="single" w:sz="6" w:space="0" w:color="C4C7C5"/>
+              <w:right w:val="single" w:sz="6" w:space="0" w:color="C4C7C5"/>
+            </w:tcBorders>
+            <w:tcMar>
+              <w:top w:w="120" w:type="dxa"/>
+              <w:left w:w="180" w:type="dxa"/>
+              <w:bottom w:w="120" w:type="dxa"/>
+              <w:right w:w="180" w:type="dxa"/>
+            </w:tcMar>
+            <w:vAlign w:val="center"/>
+          </w:tcPr>
+          <w:p>
+            <w:pPr>
+              <w:rPr>
+                <w:b/>
+                <w:bCs/>
+              </w:rPr>
+            </w:pPr>
+            <w:r>
+              <w:rPr>
+                <w:b/>
+                <w:bCs/>
+              </w:rPr>
+              <w:t>PAT-046</w:t>
+            </w:r>
+          </w:p>
+        </w:tc>
+        <w:tc>
+          <w:tcPr>
+            <w:tcW w:w="0" w:type="auto"/>
+            <w:tcBorders>
+              <w:top w:val="single" w:sz="6" w:space="0" w:color="C4C7C5"/>
+              <w:left w:val="single" w:sz="6" w:space="0" w:color="C4C7C5"/>
+              <w:bottom w:val="single" w:sz="6" w:space="0" w:color="C4C7C5"/>
+              <w:right w:val="single" w:sz="6" w:space="0" w:color="C4C7C5"/>
+            </w:tcBorders>
+            <w:tcMar>
+              <w:top w:w="120" w:type="dxa"/>
+              <w:left w:w="180" w:type="dxa"/>
+              <w:bottom w:w="120" w:type="dxa"/>
+              <w:right w:w="180" w:type="dxa"/>
+            </w:tcMar>
+            <w:vAlign w:val="center"/>
+          </w:tcPr>
+          <w:p>
+            <w:r>
+              <w:t>Workspace Scalability</w:t>
+            </w:r>
+          </w:p>
+        </w:tc>
+        <w:tc>
+          <w:tcPr>
+            <w:tcW w:w="0" w:type="auto"/>
+            <w:tcBorders>
+              <w:top w:val="single" w:sz="6" w:space="0" w:color="C4C7C5"/>
+              <w:left w:val="single" w:sz="6" w:space="0" w:color="C4C7C5"/>
+              <w:bottom w:val="single" w:sz="6" w:space="0" w:color="C4C7C5"/>
+              <w:right w:val="single" w:sz="6" w:space="0" w:color="C4C7C5"/>
+            </w:tcBorders>
+            <w:tcMar>
+              <w:top w:w="120" w:type="dxa"/>
+              <w:left w:w="180" w:type="dxa"/>
+              <w:bottom w:w="120" w:type="dxa"/>
+              <w:right w:w="180" w:type="dxa"/>
+            </w:tcMar>
+            <w:vAlign w:val="center"/>
+          </w:tcPr>
+          <w:p>
+            <w:r>
+              <w:t>Accepted</w:t>
+            </w:r>
+          </w:p>
+        </w:tc>
+      </w:tr>
     </w:tbl>
     <w:p>
       <w:pPr>
@@ -4078,7 +4330,14 @@
                 <w:b/>
                 <w:bCs/>
               </w:rPr>
-              <w:t>43</w:t>
+              <w:t>4</w:t>
+            </w:r>
+            <w:r>
+              <w:rPr>
+                <w:b/>
+                <w:bCs/>
+              </w:rPr>
+              <w:t>6</w:t>
             </w:r>
           </w:p>
         </w:tc>
@@ -4135,11 +4394,7 @@
           </w:tcPr>
           <w:p>
             <w:r>
-              <w:rPr>
-                <w:b/>
-                <w:bCs/>
-              </w:rPr>
-              <w:t>17</w:t>
+              <w:t>20</w:t>
             </w:r>
           </w:p>
         </w:tc>
@@ -4312,6 +4567,7 @@
         </w:numPr>
       </w:pPr>
       <w:r>
+        <w:lastRenderedPageBreak/>
         <w:t>The Registry shall be updated whenever a Pattern is created, accepted, revised, or deprecated.</w:t>
       </w:r>
     </w:p>
@@ -4345,7 +4601,6 @@
         </w:numPr>
       </w:pPr>
       <w:r>
-        <w:lastRenderedPageBreak/>
         <w:t>The Pattern Registry serves solely as the authoritative index for identifying and locating Patterns.</w:t>
       </w:r>
     </w:p>
@@ -7062,4 +7317,16 @@
     </a:ext>
   </a:extLst>
 </a:theme>
+</file>
+
+<file path=customXml/item1.xml><?xml version="1.0" encoding="utf-8"?>
+<b:Sources xmlns:b="http://schemas.openxmlformats.org/officeDocument/2006/bibliography" xmlns="http://schemas.openxmlformats.org/officeDocument/2006/bibliography" SelectedStyle="\APASixthEditionOfficeOnline.xsl" StyleName="APA" Version="6"/>
+</file>
+
+<file path=customXml/itemProps1.xml><?xml version="1.0" encoding="utf-8"?>
+<ds:datastoreItem xmlns:ds="http://schemas.openxmlformats.org/officeDocument/2006/customXml" ds:itemID="{E4A02C1F-8AE8-4625-90B8-95C5DD65E82E}">
+  <ds:schemaRefs>
+    <ds:schemaRef ds:uri="http://schemas.openxmlformats.org/officeDocument/2006/bibliography"/>
+  </ds:schemaRefs>
+</ds:datastoreItem>
 </file>
</xml_diff>